<commit_message>
docs: add UML members and notation legend
</commit_message>
<xml_diff>
--- a/docs/Assignment_4_Facade_Report.docx
+++ b/docs/Assignment_4_Facade_Report.docx
@@ -193,7 +193,7 @@
           <w:szCs w:val="24"/>
           <w:lang w:val="en-US"/>
         </w:rPr>
-        <w:t xml:space="preserve">Repository: https://github.com/adilzhandev/assignment-4-facade-pattern</w:t>
+        <w:t xml:space="preserve">Repository: https://github.com/adilzhandev/AITU-SDP-A4-Facade</w:t>
       </w:r>
     </w:p>
     <w:p>
@@ -392,9 +392,9 @@
         <w:rPr/>
         <w:drawing>
           <wp:inline distT="0" distB="0" distL="0" distR="0">
-            <wp:extent cx="5750000" cy="3593750"/>
+            <wp:extent cx="5088194" cy="6309360"/>
             <wp:effectExtent l="0" t="0" r="0" b="0"/>
-            <wp:docPr id="1" name="Facade class diagram" descr="Class names and directed relationships in the order processing application"/>
+            <wp:docPr id="1" name="Facade class diagram" descr="Classes, fields, methods, and directed relationships in the order processing application"/>
             <wp:cNvGraphicFramePr>
               <a:graphicFrameLocks xmlns:a="http://schemas.openxmlformats.org/drawingml/2006/main" noChangeAspect="1"/>
             </wp:cNvGraphicFramePr>
@@ -416,7 +416,7 @@
                   <pic:spPr bwMode="auto">
                     <a:xfrm>
                       <a:off x="0" y="0"/>
-                      <a:ext cx="5750000" cy="3593750"/>
+                      <a:ext cx="5088194" cy="6309360"/>
                     </a:xfrm>
                     <a:prstGeom prst="rect">
                       <a:avLst/>
@@ -447,7 +447,7 @@
           <w:szCs w:val="20"/>
           <w:lang w:val="en-US"/>
         </w:rPr>
-        <w:t xml:space="preserve">Figure 1 — Class names and relationships in the Facade implementation</w:t>
+        <w:t xml:space="preserve">Figure 1 — Classes, fields, methods, and relationships in the Facade implementation</w:t>
       </w:r>
     </w:p>
     <w:p>
@@ -464,576 +464,7 @@
           <w:szCs w:val="24"/>
           <w:lang w:val="en-US"/>
         </w:rPr>
-        <w:t xml:space="preserve">The table below shows which class has which role in the pattern.</w:t>
-      </w:r>
-    </w:p>
-    <w:tbl>
-      <w:tblPr>
-        <w:tblW w:w="9072" w:type="dxa"/>
-        <w:jc w:val="start"/>
-        <w:tblInd w:w="0" w:type="dxa"/>
-        <w:tblLayout w:type="fixed"/>
-        <w:tblCellMar>
-          <w:top w:w="80" w:type="dxa"/>
-          <w:start w:w="120" w:type="dxa"/>
-          <w:bottom w:w="80" w:type="dxa"/>
-          <w:end w:w="120" w:type="dxa"/>
-        </w:tblCellMar>
-      </w:tblPr>
-      <w:tblGrid>
-        <w:gridCol w:w="3098"/>
-        <w:gridCol w:w="5974"/>
-      </w:tblGrid>
-      <w:tr>
-        <w:trPr>
-          <w:tblHeader w:val="true"/>
-          <w:cantSplit w:val="true"/>
-        </w:trPr>
-        <w:tc>
-          <w:tcPr>
-            <w:tcW w:w="3098" w:type="dxa"/>
-            <w:tcBorders>
-              <w:top w:val="single" w:sz="4" w:space="0" w:color="000000"/>
-              <w:start w:val="single" w:sz="4" w:space="0" w:color="000000"/>
-              <w:bottom w:val="single" w:sz="4" w:space="0" w:color="000000"/>
-              <w:end w:val="single" w:sz="4" w:space="0" w:color="000000"/>
-            </w:tcBorders>
-            <w:shd w:color="auto" w:fill="E8EEF5" w:val="clear"/>
-          </w:tcPr>
-          <w:p>
-            <w:pPr>
-              <w:pStyle w:val="Normal"/>
-              <w:spacing w:lineRule="auto" w:line="240" w:before="0" w:after="0"/>
-              <w:jc w:val="start"/>
-              <w:rPr/>
-            </w:pPr>
-            <w:r>
-              <w:rPr>
-                <w:rFonts w:eastAsia="Times New Roman" w:cs="Times New Roman"/>
-                <w:b/>
-                <w:bCs/>
-                <w:sz w:val="22"/>
-                <w:szCs w:val="22"/>
-              </w:rPr>
-              <w:t>Role in the pattern</w:t>
-            </w:r>
-          </w:p>
-        </w:tc>
-        <w:tc>
-          <w:tcPr>
-            <w:tcW w:w="5974" w:type="dxa"/>
-            <w:tcBorders>
-              <w:top w:val="single" w:sz="4" w:space="0" w:color="000000"/>
-              <w:start w:val="single" w:sz="4" w:space="0" w:color="000000"/>
-              <w:bottom w:val="single" w:sz="4" w:space="0" w:color="000000"/>
-              <w:end w:val="single" w:sz="4" w:space="0" w:color="000000"/>
-            </w:tcBorders>
-            <w:shd w:color="auto" w:fill="E8EEF5" w:val="clear"/>
-          </w:tcPr>
-          <w:p>
-            <w:pPr>
-              <w:pStyle w:val="Normal"/>
-              <w:spacing w:lineRule="auto" w:line="240" w:before="0" w:after="0"/>
-              <w:jc w:val="start"/>
-              <w:rPr/>
-            </w:pPr>
-            <w:r>
-              <w:rPr>
-                <w:rFonts w:eastAsia="Times New Roman" w:cs="Times New Roman"/>
-                <w:b/>
-                <w:bCs/>
-                <w:sz w:val="22"/>
-                <w:szCs w:val="22"/>
-              </w:rPr>
-              <w:t>Class in this project</w:t>
-            </w:r>
-          </w:p>
-        </w:tc>
-      </w:tr>
-      <w:tr>
-        <w:trPr>
-          <w:cantSplit w:val="true"/>
-        </w:trPr>
-        <w:tc>
-          <w:tcPr>
-            <w:tcW w:w="3098" w:type="dxa"/>
-            <w:tcBorders>
-              <w:top w:val="single" w:sz="4" w:space="0" w:color="000000"/>
-              <w:start w:val="single" w:sz="4" w:space="0" w:color="000000"/>
-              <w:bottom w:val="single" w:sz="4" w:space="0" w:color="000000"/>
-              <w:end w:val="single" w:sz="4" w:space="0" w:color="000000"/>
-            </w:tcBorders>
-          </w:tcPr>
-          <w:p>
-            <w:pPr>
-              <w:pStyle w:val="Normal"/>
-              <w:spacing w:lineRule="auto" w:line="240" w:before="0" w:after="0"/>
-              <w:jc w:val="start"/>
-              <w:rPr/>
-            </w:pPr>
-            <w:r>
-              <w:rPr>
-                <w:rFonts w:eastAsia="Times New Roman" w:cs="Times New Roman"/>
-                <w:b w:val="false"/>
-                <w:bCs w:val="false"/>
-                <w:sz w:val="22"/>
-                <w:szCs w:val="22"/>
-              </w:rPr>
-              <w:t>Client</w:t>
-            </w:r>
-          </w:p>
-        </w:tc>
-        <w:tc>
-          <w:tcPr>
-            <w:tcW w:w="5974" w:type="dxa"/>
-            <w:tcBorders>
-              <w:top w:val="single" w:sz="4" w:space="0" w:color="000000"/>
-              <w:start w:val="single" w:sz="4" w:space="0" w:color="000000"/>
-              <w:bottom w:val="single" w:sz="4" w:space="0" w:color="000000"/>
-              <w:end w:val="single" w:sz="4" w:space="0" w:color="000000"/>
-            </w:tcBorders>
-          </w:tcPr>
-          <w:p>
-            <w:pPr>
-              <w:pStyle w:val="Normal"/>
-              <w:spacing w:lineRule="auto" w:line="240" w:before="0" w:after="0"/>
-              <w:jc w:val="start"/>
-              <w:rPr/>
-            </w:pPr>
-            <w:r>
-              <w:rPr>
-                <w:rFonts w:eastAsia="Consolas" w:cs="Consolas" w:ascii="Consolas" w:hAnsi="Consolas"/>
-                <w:b w:val="false"/>
-                <w:bCs w:val="false"/>
-                <w:sz w:val="20"/>
-                <w:szCs w:val="20"/>
-              </w:rPr>
-              <w:t>Main</w:t>
-            </w:r>
-          </w:p>
-        </w:tc>
-      </w:tr>
-      <w:tr>
-        <w:trPr>
-          <w:cantSplit w:val="true"/>
-        </w:trPr>
-        <w:tc>
-          <w:tcPr>
-            <w:tcW w:w="3098" w:type="dxa"/>
-            <w:tcBorders>
-              <w:top w:val="single" w:sz="4" w:space="0" w:color="000000"/>
-              <w:start w:val="single" w:sz="4" w:space="0" w:color="000000"/>
-              <w:bottom w:val="single" w:sz="4" w:space="0" w:color="000000"/>
-              <w:end w:val="single" w:sz="4" w:space="0" w:color="000000"/>
-            </w:tcBorders>
-          </w:tcPr>
-          <w:p>
-            <w:pPr>
-              <w:pStyle w:val="Normal"/>
-              <w:spacing w:lineRule="auto" w:line="240" w:before="0" w:after="0"/>
-              <w:jc w:val="start"/>
-              <w:rPr/>
-            </w:pPr>
-            <w:r>
-              <w:rPr>
-                <w:rFonts w:eastAsia="Times New Roman" w:cs="Times New Roman"/>
-                <w:b w:val="false"/>
-                <w:bCs w:val="false"/>
-                <w:sz w:val="22"/>
-                <w:szCs w:val="22"/>
-              </w:rPr>
-              <w:t>Facade</w:t>
-            </w:r>
-          </w:p>
-        </w:tc>
-        <w:tc>
-          <w:tcPr>
-            <w:tcW w:w="5974" w:type="dxa"/>
-            <w:tcBorders>
-              <w:top w:val="single" w:sz="4" w:space="0" w:color="000000"/>
-              <w:start w:val="single" w:sz="4" w:space="0" w:color="000000"/>
-              <w:bottom w:val="single" w:sz="4" w:space="0" w:color="000000"/>
-              <w:end w:val="single" w:sz="4" w:space="0" w:color="000000"/>
-            </w:tcBorders>
-          </w:tcPr>
-          <w:p>
-            <w:pPr>
-              <w:pStyle w:val="Normal"/>
-              <w:spacing w:lineRule="auto" w:line="240" w:before="0" w:after="0"/>
-              <w:jc w:val="start"/>
-              <w:rPr/>
-            </w:pPr>
-            <w:r>
-              <w:rPr>
-                <w:rFonts w:eastAsia="Consolas" w:cs="Consolas" w:ascii="Consolas" w:hAnsi="Consolas"/>
-                <w:b w:val="false"/>
-                <w:bCs w:val="false"/>
-                <w:sz w:val="20"/>
-                <w:szCs w:val="20"/>
-              </w:rPr>
-              <w:t>OrderFacade</w:t>
-            </w:r>
-          </w:p>
-        </w:tc>
-      </w:tr>
-      <w:tr>
-        <w:trPr>
-          <w:cantSplit w:val="true"/>
-        </w:trPr>
-        <w:tc>
-          <w:tcPr>
-            <w:tcW w:w="3098" w:type="dxa"/>
-            <w:tcBorders>
-              <w:top w:val="single" w:sz="4" w:space="0" w:color="000000"/>
-              <w:start w:val="single" w:sz="4" w:space="0" w:color="000000"/>
-              <w:bottom w:val="single" w:sz="4" w:space="0" w:color="000000"/>
-              <w:end w:val="single" w:sz="4" w:space="0" w:color="000000"/>
-            </w:tcBorders>
-          </w:tcPr>
-          <w:p>
-            <w:pPr>
-              <w:pStyle w:val="Normal"/>
-              <w:spacing w:lineRule="auto" w:line="240" w:before="0" w:after="0"/>
-              <w:jc w:val="start"/>
-              <w:rPr/>
-            </w:pPr>
-            <w:r>
-              <w:rPr>
-                <w:rFonts w:eastAsia="Times New Roman" w:cs="Times New Roman"/>
-                <w:b w:val="false"/>
-                <w:bCs w:val="false"/>
-                <w:sz w:val="22"/>
-                <w:szCs w:val="22"/>
-              </w:rPr>
-              <w:t>Inventory subsystem</w:t>
-            </w:r>
-          </w:p>
-        </w:tc>
-        <w:tc>
-          <w:tcPr>
-            <w:tcW w:w="5974" w:type="dxa"/>
-            <w:tcBorders>
-              <w:top w:val="single" w:sz="4" w:space="0" w:color="000000"/>
-              <w:start w:val="single" w:sz="4" w:space="0" w:color="000000"/>
-              <w:bottom w:val="single" w:sz="4" w:space="0" w:color="000000"/>
-              <w:end w:val="single" w:sz="4" w:space="0" w:color="000000"/>
-            </w:tcBorders>
-          </w:tcPr>
-          <w:p>
-            <w:pPr>
-              <w:pStyle w:val="Normal"/>
-              <w:spacing w:lineRule="auto" w:line="240" w:before="0" w:after="0"/>
-              <w:jc w:val="start"/>
-              <w:rPr/>
-            </w:pPr>
-            <w:r>
-              <w:rPr>
-                <w:rFonts w:eastAsia="Consolas" w:cs="Consolas" w:ascii="Consolas" w:hAnsi="Consolas"/>
-                <w:b w:val="false"/>
-                <w:bCs w:val="false"/>
-                <w:sz w:val="20"/>
-                <w:szCs w:val="20"/>
-              </w:rPr>
-              <w:t>InventoryService</w:t>
-            </w:r>
-          </w:p>
-        </w:tc>
-      </w:tr>
-      <w:tr>
-        <w:trPr>
-          <w:cantSplit w:val="true"/>
-        </w:trPr>
-        <w:tc>
-          <w:tcPr>
-            <w:tcW w:w="3098" w:type="dxa"/>
-            <w:tcBorders>
-              <w:top w:val="single" w:sz="4" w:space="0" w:color="000000"/>
-              <w:start w:val="single" w:sz="4" w:space="0" w:color="000000"/>
-              <w:bottom w:val="single" w:sz="4" w:space="0" w:color="000000"/>
-              <w:end w:val="single" w:sz="4" w:space="0" w:color="000000"/>
-            </w:tcBorders>
-          </w:tcPr>
-          <w:p>
-            <w:pPr>
-              <w:pStyle w:val="Normal"/>
-              <w:spacing w:lineRule="auto" w:line="240" w:before="0" w:after="0"/>
-              <w:jc w:val="start"/>
-              <w:rPr/>
-            </w:pPr>
-            <w:r>
-              <w:rPr>
-                <w:rFonts w:eastAsia="Times New Roman" w:cs="Times New Roman"/>
-                <w:b w:val="false"/>
-                <w:bCs w:val="false"/>
-                <w:sz w:val="22"/>
-                <w:szCs w:val="22"/>
-              </w:rPr>
-              <w:t>Payment subsystem</w:t>
-            </w:r>
-          </w:p>
-        </w:tc>
-        <w:tc>
-          <w:tcPr>
-            <w:tcW w:w="5974" w:type="dxa"/>
-            <w:tcBorders>
-              <w:top w:val="single" w:sz="4" w:space="0" w:color="000000"/>
-              <w:start w:val="single" w:sz="4" w:space="0" w:color="000000"/>
-              <w:bottom w:val="single" w:sz="4" w:space="0" w:color="000000"/>
-              <w:end w:val="single" w:sz="4" w:space="0" w:color="000000"/>
-            </w:tcBorders>
-          </w:tcPr>
-          <w:p>
-            <w:pPr>
-              <w:pStyle w:val="Normal"/>
-              <w:spacing w:lineRule="auto" w:line="240" w:before="0" w:after="0"/>
-              <w:jc w:val="start"/>
-              <w:rPr/>
-            </w:pPr>
-            <w:r>
-              <w:rPr>
-                <w:rFonts w:eastAsia="Consolas" w:cs="Consolas" w:ascii="Consolas" w:hAnsi="Consolas"/>
-                <w:b w:val="false"/>
-                <w:bCs w:val="false"/>
-                <w:sz w:val="20"/>
-                <w:szCs w:val="20"/>
-              </w:rPr>
-              <w:t>PaymentProcessor</w:t>
-            </w:r>
-          </w:p>
-        </w:tc>
-      </w:tr>
-      <w:tr>
-        <w:trPr>
-          <w:cantSplit w:val="true"/>
-        </w:trPr>
-        <w:tc>
-          <w:tcPr>
-            <w:tcW w:w="3098" w:type="dxa"/>
-            <w:tcBorders>
-              <w:top w:val="single" w:sz="4" w:space="0" w:color="000000"/>
-              <w:start w:val="single" w:sz="4" w:space="0" w:color="000000"/>
-              <w:bottom w:val="single" w:sz="4" w:space="0" w:color="000000"/>
-              <w:end w:val="single" w:sz="4" w:space="0" w:color="000000"/>
-            </w:tcBorders>
-          </w:tcPr>
-          <w:p>
-            <w:pPr>
-              <w:pStyle w:val="Normal"/>
-              <w:spacing w:lineRule="auto" w:line="240" w:before="0" w:after="0"/>
-              <w:jc w:val="start"/>
-              <w:rPr/>
-            </w:pPr>
-            <w:r>
-              <w:rPr>
-                <w:rFonts w:eastAsia="Times New Roman" w:cs="Times New Roman"/>
-                <w:b w:val="false"/>
-                <w:bCs w:val="false"/>
-                <w:sz w:val="22"/>
-                <w:szCs w:val="22"/>
-              </w:rPr>
-              <w:t>Shipping subsystem</w:t>
-            </w:r>
-          </w:p>
-        </w:tc>
-        <w:tc>
-          <w:tcPr>
-            <w:tcW w:w="5974" w:type="dxa"/>
-            <w:tcBorders>
-              <w:top w:val="single" w:sz="4" w:space="0" w:color="000000"/>
-              <w:start w:val="single" w:sz="4" w:space="0" w:color="000000"/>
-              <w:bottom w:val="single" w:sz="4" w:space="0" w:color="000000"/>
-              <w:end w:val="single" w:sz="4" w:space="0" w:color="000000"/>
-            </w:tcBorders>
-          </w:tcPr>
-          <w:p>
-            <w:pPr>
-              <w:pStyle w:val="Normal"/>
-              <w:spacing w:lineRule="auto" w:line="240" w:before="0" w:after="0"/>
-              <w:jc w:val="start"/>
-              <w:rPr/>
-            </w:pPr>
-            <w:r>
-              <w:rPr>
-                <w:rFonts w:eastAsia="Consolas" w:cs="Consolas" w:ascii="Consolas" w:hAnsi="Consolas"/>
-                <w:b w:val="false"/>
-                <w:bCs w:val="false"/>
-                <w:sz w:val="20"/>
-                <w:szCs w:val="20"/>
-              </w:rPr>
-              <w:t>ShippingService</w:t>
-            </w:r>
-          </w:p>
-        </w:tc>
-      </w:tr>
-      <w:tr>
-        <w:trPr>
-          <w:cantSplit w:val="true"/>
-        </w:trPr>
-        <w:tc>
-          <w:tcPr>
-            <w:tcW w:w="3098" w:type="dxa"/>
-            <w:tcBorders>
-              <w:top w:val="single" w:sz="4" w:space="0" w:color="000000"/>
-              <w:start w:val="single" w:sz="4" w:space="0" w:color="000000"/>
-              <w:bottom w:val="single" w:sz="4" w:space="0" w:color="000000"/>
-              <w:end w:val="single" w:sz="4" w:space="0" w:color="000000"/>
-            </w:tcBorders>
-          </w:tcPr>
-          <w:p>
-            <w:pPr>
-              <w:pStyle w:val="Normal"/>
-              <w:spacing w:lineRule="auto" w:line="240" w:before="0" w:after="0"/>
-              <w:jc w:val="start"/>
-              <w:rPr/>
-            </w:pPr>
-            <w:r>
-              <w:rPr>
-                <w:rFonts w:eastAsia="Times New Roman" w:cs="Times New Roman"/>
-                <w:b w:val="false"/>
-                <w:bCs w:val="false"/>
-                <w:sz w:val="22"/>
-                <w:szCs w:val="22"/>
-              </w:rPr>
-              <w:t>Notification subsystem</w:t>
-            </w:r>
-          </w:p>
-        </w:tc>
-        <w:tc>
-          <w:tcPr>
-            <w:tcW w:w="5974" w:type="dxa"/>
-            <w:tcBorders>
-              <w:top w:val="single" w:sz="4" w:space="0" w:color="000000"/>
-              <w:start w:val="single" w:sz="4" w:space="0" w:color="000000"/>
-              <w:bottom w:val="single" w:sz="4" w:space="0" w:color="000000"/>
-              <w:end w:val="single" w:sz="4" w:space="0" w:color="000000"/>
-            </w:tcBorders>
-          </w:tcPr>
-          <w:p>
-            <w:pPr>
-              <w:pStyle w:val="Normal"/>
-              <w:spacing w:lineRule="auto" w:line="240" w:before="0" w:after="0"/>
-              <w:jc w:val="start"/>
-              <w:rPr/>
-            </w:pPr>
-            <w:r>
-              <w:rPr>
-                <w:rFonts w:eastAsia="Consolas" w:cs="Consolas" w:ascii="Consolas" w:hAnsi="Consolas"/>
-                <w:b w:val="false"/>
-                <w:bCs w:val="false"/>
-                <w:sz w:val="20"/>
-                <w:szCs w:val="20"/>
-              </w:rPr>
-              <w:t>NotificationService</w:t>
-            </w:r>
-          </w:p>
-        </w:tc>
-      </w:tr>
-      <w:tr>
-        <w:trPr>
-          <w:cantSplit w:val="true"/>
-        </w:trPr>
-        <w:tc>
-          <w:tcPr>
-            <w:tcW w:w="3098" w:type="dxa"/>
-            <w:tcBorders>
-              <w:top w:val="single" w:sz="4" w:space="0" w:color="000000"/>
-              <w:start w:val="single" w:sz="4" w:space="0" w:color="000000"/>
-              <w:bottom w:val="single" w:sz="4" w:space="0" w:color="000000"/>
-              <w:end w:val="single" w:sz="4" w:space="0" w:color="000000"/>
-            </w:tcBorders>
-          </w:tcPr>
-          <w:p>
-            <w:pPr>
-              <w:pStyle w:val="Normal"/>
-              <w:spacing w:lineRule="auto" w:line="240" w:before="0" w:after="0"/>
-              <w:jc w:val="start"/>
-              <w:rPr/>
-            </w:pPr>
-            <w:r>
-              <w:rPr>
-                <w:rFonts w:eastAsia="Times New Roman" w:cs="Times New Roman"/>
-                <w:b w:val="false"/>
-                <w:bCs w:val="false"/>
-                <w:sz w:val="22"/>
-                <w:szCs w:val="22"/>
-              </w:rPr>
-              <w:t>Data records</w:t>
-            </w:r>
-          </w:p>
-        </w:tc>
-        <w:tc>
-          <w:tcPr>
-            <w:tcW w:w="5974" w:type="dxa"/>
-            <w:tcBorders>
-              <w:top w:val="single" w:sz="4" w:space="0" w:color="000000"/>
-              <w:start w:val="single" w:sz="4" w:space="0" w:color="000000"/>
-              <w:bottom w:val="single" w:sz="4" w:space="0" w:color="000000"/>
-              <w:end w:val="single" w:sz="4" w:space="0" w:color="000000"/>
-            </w:tcBorders>
-          </w:tcPr>
-          <w:p>
-            <w:pPr>
-              <w:pStyle w:val="Normal"/>
-              <w:spacing w:lineRule="auto" w:line="240" w:before="0" w:after="0"/>
-              <w:jc w:val="start"/>
-              <w:rPr/>
-            </w:pPr>
-            <w:r>
-              <w:rPr>
-                <w:rFonts w:eastAsia="Consolas" w:cs="Consolas" w:ascii="Consolas" w:hAnsi="Consolas"/>
-                <w:b w:val="false"/>
-                <w:bCs w:val="false"/>
-                <w:sz w:val="20"/>
-                <w:szCs w:val="20"/>
-              </w:rPr>
-              <w:t>Customer, Order</w:t>
-            </w:r>
-          </w:p>
-        </w:tc>
-      </w:tr>
-    </w:tbl>
-    <w:p>
-      <w:pPr>
-        <w:pStyle w:val="Normal"/>
-        <w:spacing w:before="0" w:after="160"/>
-        <w:rPr/>
-      </w:pPr>
-      <w:r>
-        <w:rPr/>
-      </w:r>
-    </w:p>
-    <w:p>
-      <w:pPr>
-        <w:pStyle w:val="Normal"/>
-        <w:spacing w:lineRule="auto" w:line="276" w:before="0" w:after="140"/>
-        <w:jc w:val="both"/>
-        <w:rPr/>
-      </w:pPr>
-      <w:r>
-        <w:rPr>
-          <w:rFonts w:eastAsia="Times New Roman" w:cs="Times New Roman"/>
-          <w:sz w:val="24"/>
-          <w:szCs w:val="24"/>
-          <w:lang w:val="en-US"/>
-        </w:rPr>
-        <w:t xml:space="preserve">Main calls OrderFacade and uses Customer and Order as data. The facade coordinates the four services and stores successful orders. Solid arrows show stored references; dashed arrows show dependencies. The diagram shows the main relationships and leaves out attributes, methods, and the status enumeration.</w:t>
-      </w:r>
-    </w:p>
-    <w:p>
-      <w:pPr>
-        <w:pStyle w:val="Normal"/>
-        <w:spacing w:lineRule="auto" w:line="276" w:before="0" w:after="140"/>
-        <w:jc w:val="both"/>
-        <w:rPr/>
-      </w:pPr>
-      <w:r>
-        <w:rPr>
-          <w:rFonts w:eastAsia="Times New Roman" w:cs="Times New Roman"/>
-          <w:sz w:val="24"/>
-          <w:szCs w:val="24"/>
-          <w:lang w:val="en-US"/>
-        </w:rPr>
-        <w:t xml:space="preserve">None of the services has a reference to OrderFacade. An advanced client can create the services directly and coordinate them itself. The facade provides a simpler way to use them without making them inaccessible.</w:t>
+        <w:t xml:space="preserve">Main is the client; OrderFacade coordinates the four services and stores Order records. Customer carries the customer details. Field and method names are shown without types or parameters; constructors, generated record accessors, and nested helper types are omitted for readability. The legend explains the notation. The services have no reference to the facade and remain directly accessible.</w:t>
       </w:r>
     </w:p>
     <w:p>
@@ -2123,7 +1554,7 @@
           <w:szCs w:val="24"/>
           <w:lang w:val="en-US"/>
         </w:rPr>
-        <w:t xml:space="preserve">Source code: https://github.com/adilzhandev/assignment-4-facade-pattern</w:t>
+        <w:t xml:space="preserve">Source code: https://github.com/adilzhandev/AITU-SDP-A4-Facade</w:t>
       </w:r>
     </w:p>
     <w:p>

</xml_diff>